<commit_message>
quinto comit creacion xls, docx y pdf
</commit_message>
<xml_diff>
--- a/costos.docx
+++ b/costos.docx
@@ -75,7 +75,7 @@
           </w:tcPr>
           <w:p>
             <w:r>
-              <w:t>azul</w:t>
+              <w:t>camara</w:t>
             </w:r>
           </w:p>
         </w:tc>
@@ -85,7 +85,7 @@
           </w:tcPr>
           <w:p>
             <w:r>
-              <w:t>4</w:t>
+              <w:t>8</w:t>
             </w:r>
           </w:p>
         </w:tc>
@@ -95,7 +95,7 @@
           </w:tcPr>
           <w:p>
             <w:r>
-              <w:t>18000.0</w:t>
+              <w:t>664000.0</w:t>
             </w:r>
           </w:p>
         </w:tc>
@@ -105,7 +105,7 @@
           </w:tcPr>
           <w:p>
             <w:r>
-              <w:t>3060.0</w:t>
+              <w:t>112880.0</w:t>
             </w:r>
           </w:p>
         </w:tc>
@@ -117,7 +117,7 @@
           </w:tcPr>
           <w:p>
             <w:r>
-              <w:t>rojo</w:t>
+              <w:t>dvr</w:t>
             </w:r>
           </w:p>
         </w:tc>
@@ -127,7 +127,7 @@
           </w:tcPr>
           <w:p>
             <w:r>
-              <w:t>5</w:t>
+              <w:t>1</w:t>
             </w:r>
           </w:p>
         </w:tc>
@@ -137,7 +137,7 @@
           </w:tcPr>
           <w:p>
             <w:r>
-              <w:t>17000.0</w:t>
+              <w:t>125000.0</w:t>
             </w:r>
           </w:p>
         </w:tc>
@@ -147,7 +147,7 @@
           </w:tcPr>
           <w:p>
             <w:r>
-              <w:t>2890.0</w:t>
+              <w:t>21250.0</w:t>
             </w:r>
           </w:p>
         </w:tc>
@@ -159,7 +159,7 @@
           </w:tcPr>
           <w:p>
             <w:r>
-              <w:t>marron</w:t>
+              <w:t>bobinas de cable</w:t>
             </w:r>
           </w:p>
         </w:tc>
@@ -169,7 +169,7 @@
           </w:tcPr>
           <w:p>
             <w:r>
-              <w:t>2</w:t>
+              <w:t>1</w:t>
             </w:r>
           </w:p>
         </w:tc>
@@ -179,7 +179,7 @@
           </w:tcPr>
           <w:p>
             <w:r>
-              <w:t>2400.0</w:t>
+              <w:t>175000.0</w:t>
             </w:r>
           </w:p>
         </w:tc>
@@ -189,7 +189,49 @@
           </w:tcPr>
           <w:p>
             <w:r>
-              <w:t>408.0</w:t>
+              <w:t>29750.0</w:t>
+            </w:r>
+          </w:p>
+        </w:tc>
+      </w:tr>
+      <w:tr>
+        <w:tc>
+          <w:tcPr>
+            <w:tcW w:type="dxa" w:w="2160"/>
+          </w:tcPr>
+          <w:p>
+            <w:r>
+              <w:t>switch</w:t>
+            </w:r>
+          </w:p>
+        </w:tc>
+        <w:tc>
+          <w:tcPr>
+            <w:tcW w:type="dxa" w:w="2160"/>
+          </w:tcPr>
+          <w:p>
+            <w:r>
+              <w:t>1</w:t>
+            </w:r>
+          </w:p>
+        </w:tc>
+        <w:tc>
+          <w:tcPr>
+            <w:tcW w:type="dxa" w:w="2160"/>
+          </w:tcPr>
+          <w:p>
+            <w:r>
+              <w:t>90000.0</w:t>
+            </w:r>
+          </w:p>
+        </w:tc>
+        <w:tc>
+          <w:tcPr>
+            <w:tcW w:type="dxa" w:w="2160"/>
+          </w:tcPr>
+          <w:p>
+            <w:r>
+              <w:t>15300.0</w:t>
             </w:r>
           </w:p>
         </w:tc>
@@ -198,17 +240,17 @@
     <w:p>
       <w:r>
         <w:br/>
-        <w:t>Total presupuesto: $52947.18</w:t>
+        <w:t>Total presupuesto: $1492147.8</w:t>
       </w:r>
     </w:p>
     <w:p>
       <w:r>
-        <w:t>Costo total: $37,400.00</w:t>
+        <w:t>Costo total: $1,054,000.00</w:t>
       </w:r>
     </w:p>
     <w:p>
       <w:r>
-        <w:t>Ganancia total: $6,358.00</w:t>
+        <w:t>Ganancia total: $179,180.00</w:t>
       </w:r>
     </w:p>
     <w:sectPr>

</xml_diff>

<commit_message>
sexto comit creacion xls, docx, pdf y cmbinacion de archvos
</commit_message>
<xml_diff>
--- a/costos.docx
+++ b/costos.docx
@@ -85,7 +85,7 @@
           </w:tcPr>
           <w:p>
             <w:r>
-              <w:t>8</w:t>
+              <w:t>2</w:t>
             </w:r>
           </w:p>
         </w:tc>
@@ -95,7 +95,7 @@
           </w:tcPr>
           <w:p>
             <w:r>
-              <w:t>664000.0</w:t>
+              <w:t>160000.0</w:t>
             </w:r>
           </w:p>
         </w:tc>
@@ -105,7 +105,7 @@
           </w:tcPr>
           <w:p>
             <w:r>
-              <w:t>112880.0</w:t>
+              <w:t>27200.0</w:t>
             </w:r>
           </w:p>
         </w:tc>
@@ -137,7 +137,7 @@
           </w:tcPr>
           <w:p>
             <w:r>
-              <w:t>125000.0</w:t>
+              <w:t>120000.0</w:t>
             </w:r>
           </w:p>
         </w:tc>
@@ -147,7 +147,7 @@
           </w:tcPr>
           <w:p>
             <w:r>
-              <w:t>21250.0</w:t>
+              <w:t>20400.0</w:t>
             </w:r>
           </w:p>
         </w:tc>
@@ -159,7 +159,7 @@
           </w:tcPr>
           <w:p>
             <w:r>
-              <w:t>bobinas de cable</w:t>
+              <w:t>bobina de cable</w:t>
             </w:r>
           </w:p>
         </w:tc>
@@ -179,7 +179,7 @@
           </w:tcPr>
           <w:p>
             <w:r>
-              <w:t>175000.0</w:t>
+              <w:t>180000.0</w:t>
             </w:r>
           </w:p>
         </w:tc>
@@ -189,7 +189,7 @@
           </w:tcPr>
           <w:p>
             <w:r>
-              <w:t>29750.0</w:t>
+              <w:t>30600.0</w:t>
             </w:r>
           </w:p>
         </w:tc>
@@ -201,7 +201,7 @@
           </w:tcPr>
           <w:p>
             <w:r>
-              <w:t>switch</w:t>
+              <w:t>swith</w:t>
             </w:r>
           </w:p>
         </w:tc>
@@ -221,7 +221,7 @@
           </w:tcPr>
           <w:p>
             <w:r>
-              <w:t>90000.0</w:t>
+              <w:t>60000.0</w:t>
             </w:r>
           </w:p>
         </w:tc>
@@ -231,7 +231,7 @@
           </w:tcPr>
           <w:p>
             <w:r>
-              <w:t>15300.0</w:t>
+              <w:t>10200.0</w:t>
             </w:r>
           </w:p>
         </w:tc>
@@ -240,17 +240,17 @@
     <w:p>
       <w:r>
         <w:br/>
-        <w:t>Total presupuesto: $1492147.8</w:t>
+        <w:t>Total presupuesto: $736164.0</w:t>
       </w:r>
     </w:p>
     <w:p>
       <w:r>
-        <w:t>Costo total: $1,054,000.00</w:t>
+        <w:t>Costo total: $520,000.00</w:t>
       </w:r>
     </w:p>
     <w:p>
       <w:r>
-        <w:t>Ganancia total: $179,180.00</w:t>
+        <w:t>Ganancia total: $88,400.00</w:t>
       </w:r>
     </w:p>
     <w:sectPr>

</xml_diff>